<commit_message>
feat(v2): editor/preview enhancement suite + Mermaid fit-to-width + startup crash fix
- marksmith-v2: 40+ editor & preview improvements (find/replace, split view, line numbers, lint panel, focus mode, text transforms, line ops, cleanup, word wrap, print)

- fix: Mermaid diagrams shrink-to-fit the preview column instead of clipping at the frame edge

- fix: startup crash (STATUS_STOWED_EXCEPTION) from the Ctrl+, Settings accelerator - WinUI cannot represent a comma key in a KeyboardAccelerator, so it is now handled in code (microsoft-ui-xaml#708)
</commit_message>
<xml_diff>
--- a/marksmith-v2/test_outputs/challenger_scenario1.docx
+++ b/marksmith-v2/test_outputs/challenger_scenario1.docx
@@ -361,8 +361,8 @@
       </w:r>
     </w:p>
     <w:sectPr>
-      <w:headerReference xmlns:r="http://schemas.openxmlformats.org/officeDocument/2006/relationships" w:type="default" r:id="R5d131ebba0594e02"/>
-      <w:footerReference xmlns:r="http://schemas.openxmlformats.org/officeDocument/2006/relationships" w:type="default" r:id="R71801ccceccf4b29"/>
+      <w:headerReference xmlns:r="http://schemas.openxmlformats.org/officeDocument/2006/relationships" w:type="default" r:id="Rce9f3ce6b87c4071"/>
+      <w:footerReference xmlns:r="http://schemas.openxmlformats.org/officeDocument/2006/relationships" w:type="default" r:id="Rbe888f5c1a614527"/>
       <w:pgSz w:w="11906" w:h="16838"/>
       <w:pgMar w:top="1440" w:right="1440" w:bottom="1440" w:left="1440" w:header="576" w:footer="576" w:gutter="0"/>
       <w:pgBorders w:display="allPages" w:offsetFrom="page">

</xml_diff>

<commit_message>
✨ Spark: Add Word Count / Reading Time Pill to document
</commit_message>
<xml_diff>
--- a/marksmith-v2/test_outputs/challenger_scenario1.docx
+++ b/marksmith-v2/test_outputs/challenger_scenario1.docx
@@ -361,8 +361,8 @@
       </w:r>
     </w:p>
     <w:sectPr>
-      <w:headerReference xmlns:r="http://schemas.openxmlformats.org/officeDocument/2006/relationships" w:type="default" r:id="Rce9f3ce6b87c4071"/>
-      <w:footerReference xmlns:r="http://schemas.openxmlformats.org/officeDocument/2006/relationships" w:type="default" r:id="Rbe888f5c1a614527"/>
+      <w:headerReference xmlns:r="http://schemas.openxmlformats.org/officeDocument/2006/relationships" w:type="default" r:id="R132a0d5732404b2c"/>
+      <w:footerReference xmlns:r="http://schemas.openxmlformats.org/officeDocument/2006/relationships" w:type="default" r:id="R2e099154533a4bd0"/>
       <w:pgSz w:w="11906" w:h="16838"/>
       <w:pgMar w:top="1440" w:right="1440" w:bottom="1440" w:left="1440" w:header="576" w:footer="576" w:gutter="0"/>
       <w:pgBorders w:display="allPages" w:offsetFrom="page">

</xml_diff>

<commit_message>
✨ Spark: Add Word Count / Reading Time Pill to document (#14)
Co-authored-by: google-labs-jules[bot] <161369871+google-labs-jules[bot]@users.noreply.github.com>
</commit_message>
<xml_diff>
--- a/marksmith-v2/test_outputs/challenger_scenario1.docx
+++ b/marksmith-v2/test_outputs/challenger_scenario1.docx
@@ -361,8 +361,8 @@
       </w:r>
     </w:p>
     <w:sectPr>
-      <w:headerReference xmlns:r="http://schemas.openxmlformats.org/officeDocument/2006/relationships" w:type="default" r:id="Rce9f3ce6b87c4071"/>
-      <w:footerReference xmlns:r="http://schemas.openxmlformats.org/officeDocument/2006/relationships" w:type="default" r:id="Rbe888f5c1a614527"/>
+      <w:headerReference xmlns:r="http://schemas.openxmlformats.org/officeDocument/2006/relationships" w:type="default" r:id="R132a0d5732404b2c"/>
+      <w:footerReference xmlns:r="http://schemas.openxmlformats.org/officeDocument/2006/relationships" w:type="default" r:id="R2e099154533a4bd0"/>
       <w:pgSz w:w="11906" w:h="16838"/>
       <w:pgMar w:top="1440" w:right="1440" w:bottom="1440" w:left="1440" w:header="576" w:footer="576" w:gutter="0"/>
       <w:pgBorders w:display="allPages" w:offsetFrom="page">

</xml_diff>

<commit_message>
Tooltips across v2 UI + extension mermaid recovery + chained-arrow parser fix (QODER tasks 1-2)
- Add ToolTipService.ToolTip to ~25 uncovered controls across MainWindow, Mermaid Studio, Settings, WelcomeTour, extension bars

- extension: recoverMermaidSources handles canvas widgets, header-label wrappers, data-code attrs, text-labeled Code toggles; copybutton.js gains the same pre-pass

- FlowchartParser: ParseLine walks chained edges (A -->|Yes| B -->|No| C) with bracket-balance guard

- New MermaidSpatialMetadataService hides %% {id} position comments from the editor, re-injects on studio open/sync/save

- Tests: 719 passed / 0 failed / 21 skipped / 740 total (10 new)
</commit_message>
<xml_diff>
--- a/marksmith-v2/test_outputs/challenger_scenario1.docx
+++ b/marksmith-v2/test_outputs/challenger_scenario1.docx
@@ -361,16 +361,10 @@
       </w:r>
     </w:p>
     <w:sectPr>
-      <w:headerReference xmlns:r="http://schemas.openxmlformats.org/officeDocument/2006/relationships" w:type="default" r:id="R132a0d5732404b2c"/>
-      <w:footerReference xmlns:r="http://schemas.openxmlformats.org/officeDocument/2006/relationships" w:type="default" r:id="R2e099154533a4bd0"/>
+      <w:headerReference xmlns:r="http://schemas.openxmlformats.org/officeDocument/2006/relationships" w:type="default" r:id="R9d9cae2625f0454b"/>
+      <w:footerReference xmlns:r="http://schemas.openxmlformats.org/officeDocument/2006/relationships" w:type="default" r:id="Rb572aae90b41400d"/>
       <w:pgSz w:w="11906" w:h="16838"/>
       <w:pgMar w:top="1440" w:right="1440" w:bottom="1440" w:left="1440" w:header="576" w:footer="576" w:gutter="0"/>
-      <w:pgBorders w:display="allPages" w:offsetFrom="page">
-        <w:top w:val="single" w:color="D1D5DA" w:sz="8" w:space="24"/>
-        <w:left w:val="single" w:color="D1D5DA" w:sz="8" w:space="24"/>
-        <w:bottom w:val="single" w:color="D1D5DA" w:sz="8" w:space="24"/>
-        <w:right w:val="single" w:color="D1D5DA" w:sz="8" w:space="24"/>
-      </w:pgBorders>
     </w:sectPr>
   </w:body>
 </w:document>
@@ -630,7 +624,7 @@
   <w:docDefaults>
     <w:rPrDefault>
       <w:rPr>
-        <w:rFonts w:ascii="Calibri" w:hAnsi="Calibri" w:eastAsia="Calibri" w:cs="Calibri"/>
+        <w:rFonts w:ascii="Segoe UI Variable" w:hAnsi="Segoe UI Variable" w:eastAsia="Segoe UI Variable" w:cs="Segoe UI Variable"/>
         <w:color w:val="1b1f23"/>
         <w:kern w:val="16"/>
         <w:sz w:val="22"/>
@@ -683,7 +677,7 @@
     </w:pPr>
     <w:rPr>
       <w:b/>
-      <w:color w:val="000000"/>
+      <w:color w:val="090B0C"/>
       <w:sz w:val="32"/>
       <w:szCs w:val="32"/>
     </w:rPr>
@@ -700,7 +694,7 @@
     </w:pPr>
     <w:rPr>
       <w:b/>
-      <w:color w:val="000000"/>
+      <w:color w:val="121417"/>
       <w:sz w:val="28"/>
       <w:szCs w:val="28"/>
     </w:rPr>
@@ -717,7 +711,7 @@
     </w:pPr>
     <w:rPr>
       <w:b/>
-      <w:color w:val="000000"/>
+      <w:color w:val="1b1f23"/>
       <w:sz w:val="24"/>
       <w:szCs w:val="24"/>
     </w:rPr>
@@ -734,7 +728,7 @@
     </w:pPr>
     <w:rPr>
       <w:b/>
-      <w:color w:val="000000"/>
+      <w:color w:val="1b1f23"/>
       <w:sz w:val="22"/>
       <w:szCs w:val="22"/>
     </w:rPr>

</xml_diff>

<commit_message>
Toolbar consolidated into 5 dropdown clusters + title-bar quick actions; ApiServer auth + multi-format export tests (QODER tasks 3-4)
</commit_message>
<xml_diff>
--- a/marksmith-v2/test_outputs/challenger_scenario1.docx
+++ b/marksmith-v2/test_outputs/challenger_scenario1.docx
@@ -361,8 +361,8 @@
       </w:r>
     </w:p>
     <w:sectPr>
-      <w:headerReference xmlns:r="http://schemas.openxmlformats.org/officeDocument/2006/relationships" w:type="default" r:id="R9d9cae2625f0454b"/>
-      <w:footerReference xmlns:r="http://schemas.openxmlformats.org/officeDocument/2006/relationships" w:type="default" r:id="Rb572aae90b41400d"/>
+      <w:headerReference xmlns:r="http://schemas.openxmlformats.org/officeDocument/2006/relationships" w:type="default" r:id="R570f8d112465436b"/>
+      <w:footerReference xmlns:r="http://schemas.openxmlformats.org/officeDocument/2006/relationships" w:type="default" r:id="R906d8a7cc2f2439d"/>
       <w:pgSz w:w="11906" w:h="16838"/>
       <w:pgMar w:top="1440" w:right="1440" w:bottom="1440" w:left="1440" w:header="576" w:footer="576" w:gutter="0"/>
     </w:sectPr>

</xml_diff>

<commit_message>
Cycle 4: Mermaid Studio routing/palettes, DeepSeek+Perplexity cleaners, EPUB cover+Dublin Core, instant-export shortcuts
Task 5: connector curve routing (Elbow/Straight/Bezier) toolbar control + 4 style presets (Catppuccin Slate, Nord Ocean, Emerald Corporate, Monochrome Print) in the Studio inspector; both persisted via an %%{init}%% directive and restored on load.

Task 6: DeepSeek <think>-block strip, Perplexity [n]/[source] citation-pip strip, prompt-echo header removal + 21 tests. Fixes pre-existing ChatGPT display-math bug (double-backslash pattern never matched single-backslash \[).

Task 7: EPUB3 cover image embed (PNG/JPG) + Dublin Core metadata (dc:title/creator/language/identifier) from frontmatter or ContentLanguage + 11 tests.

Task 8: Ctrl+Shift+E (DOCX), Ctrl+Shift+P (PDF), Ctrl+Shift+M (Mermaid Studio) shortcuts; PPTX moved to Ctrl+Shift+T; live preview-zoom status-bar tooltip.

Suite: 763 passed / 0 failed / 21 skipped / 784 total.
</commit_message>
<xml_diff>
--- a/marksmith-v2/test_outputs/challenger_scenario1.docx
+++ b/marksmith-v2/test_outputs/challenger_scenario1.docx
@@ -361,8 +361,8 @@
       </w:r>
     </w:p>
     <w:sectPr>
-      <w:headerReference xmlns:r="http://schemas.openxmlformats.org/officeDocument/2006/relationships" w:type="default" r:id="R570f8d112465436b"/>
-      <w:footerReference xmlns:r="http://schemas.openxmlformats.org/officeDocument/2006/relationships" w:type="default" r:id="R906d8a7cc2f2439d"/>
+      <w:headerReference xmlns:r="http://schemas.openxmlformats.org/officeDocument/2006/relationships" w:type="default" r:id="R62bbb91af0e34c1a"/>
+      <w:footerReference xmlns:r="http://schemas.openxmlformats.org/officeDocument/2006/relationships" w:type="default" r:id="R0bc449bd658a4cb8"/>
       <w:pgSz w:w="11906" w:h="16838"/>
       <w:pgMar w:top="1440" w:right="1440" w:bottom="1440" w:left="1440" w:header="576" w:footer="576" w:gutter="0"/>
     </w:sectPr>

</xml_diff>

<commit_message>
feat: Task 10 PDF header/footer template engine & queue Task 13 update checker
</commit_message>
<xml_diff>
--- a/marksmith-v2/test_outputs/challenger_scenario1.docx
+++ b/marksmith-v2/test_outputs/challenger_scenario1.docx
@@ -361,8 +361,8 @@
       </w:r>
     </w:p>
     <w:sectPr>
-      <w:headerReference xmlns:r="http://schemas.openxmlformats.org/officeDocument/2006/relationships" w:type="default" r:id="R62bbb91af0e34c1a"/>
-      <w:footerReference xmlns:r="http://schemas.openxmlformats.org/officeDocument/2006/relationships" w:type="default" r:id="R0bc449bd658a4cb8"/>
+      <w:headerReference xmlns:r="http://schemas.openxmlformats.org/officeDocument/2006/relationships" w:type="default" r:id="R560548d60fd54677"/>
+      <w:footerReference xmlns:r="http://schemas.openxmlformats.org/officeDocument/2006/relationships" w:type="default" r:id="R2012b938333047e4"/>
       <w:pgSz w:w="11906" w:h="16838"/>
       <w:pgMar w:top="1440" w:right="1440" w:bottom="1440" w:left="1440" w:header="576" w:footer="576" w:gutter="0"/>
     </w:sectPr>

</xml_diff>

<commit_message>
feat: Task 13 UpdateService for GitHub Releases API & queue Cycle 8 tasks
</commit_message>
<xml_diff>
--- a/marksmith-v2/test_outputs/challenger_scenario1.docx
+++ b/marksmith-v2/test_outputs/challenger_scenario1.docx
@@ -361,8 +361,8 @@
       </w:r>
     </w:p>
     <w:sectPr>
-      <w:headerReference xmlns:r="http://schemas.openxmlformats.org/officeDocument/2006/relationships" w:type="default" r:id="R560548d60fd54677"/>
-      <w:footerReference xmlns:r="http://schemas.openxmlformats.org/officeDocument/2006/relationships" w:type="default" r:id="R2012b938333047e4"/>
+      <w:headerReference xmlns:r="http://schemas.openxmlformats.org/officeDocument/2006/relationships" w:type="default" r:id="R556ca1ab15f2457d"/>
+      <w:footerReference xmlns:r="http://schemas.openxmlformats.org/officeDocument/2006/relationships" w:type="default" r:id="R60e7163fa7ba4774"/>
       <w:pgSz w:w="11906" w:h="16838"/>
       <w:pgMar w:top="1440" w:right="1440" w:bottom="1440" w:left="1440" w:header="576" w:footer="576" w:gutter="0"/>
     </w:sectPr>

</xml_diff>

<commit_message>
feat: Task 14 document metrics + queue Cycle 9 tasks (Export History & Custom Fonts)
</commit_message>
<xml_diff>
--- a/marksmith-v2/test_outputs/challenger_scenario1.docx
+++ b/marksmith-v2/test_outputs/challenger_scenario1.docx
@@ -361,8 +361,8 @@
       </w:r>
     </w:p>
     <w:sectPr>
-      <w:headerReference xmlns:r="http://schemas.openxmlformats.org/officeDocument/2006/relationships" w:type="default" r:id="R556ca1ab15f2457d"/>
-      <w:footerReference xmlns:r="http://schemas.openxmlformats.org/officeDocument/2006/relationships" w:type="default" r:id="R60e7163fa7ba4774"/>
+      <w:headerReference xmlns:r="http://schemas.openxmlformats.org/officeDocument/2006/relationships" w:type="default" r:id="Rbd0424938a254bf9"/>
+      <w:footerReference xmlns:r="http://schemas.openxmlformats.org/officeDocument/2006/relationships" w:type="default" r:id="Rf77e8849187e4519"/>
       <w:pgSz w:w="11906" w:h="16838"/>
       <w:pgMar w:top="1440" w:right="1440" w:bottom="1440" w:left="1440" w:header="576" w:footer="576" w:gutter="0"/>
     </w:sectPr>

</xml_diff>

<commit_message>
feat: Task 15 Export History Journal telemetry & queue Cycle 10 tasks
</commit_message>
<xml_diff>
--- a/marksmith-v2/test_outputs/challenger_scenario1.docx
+++ b/marksmith-v2/test_outputs/challenger_scenario1.docx
@@ -361,8 +361,8 @@
       </w:r>
     </w:p>
     <w:sectPr>
-      <w:headerReference xmlns:r="http://schemas.openxmlformats.org/officeDocument/2006/relationships" w:type="default" r:id="Rbd0424938a254bf9"/>
-      <w:footerReference xmlns:r="http://schemas.openxmlformats.org/officeDocument/2006/relationships" w:type="default" r:id="Rf77e8849187e4519"/>
+      <w:headerReference xmlns:r="http://schemas.openxmlformats.org/officeDocument/2006/relationships" w:type="default" r:id="R2e4a4660406849f4"/>
+      <w:footerReference xmlns:r="http://schemas.openxmlformats.org/officeDocument/2006/relationships" w:type="default" r:id="R7317ed04b9844e10"/>
       <w:pgSz w:w="11906" w:h="16838"/>
       <w:pgMar w:top="1440" w:right="1440" w:bottom="1440" w:left="1440" w:header="576" w:footer="576" w:gutter="0"/>
     </w:sectPr>

</xml_diff>

<commit_message>
feat(navigation): Task 17 - TocExtractorService & interactive Outline flyout with click-to-scroll
</commit_message>
<xml_diff>
--- a/marksmith-v2/test_outputs/challenger_scenario1.docx
+++ b/marksmith-v2/test_outputs/challenger_scenario1.docx
@@ -361,8 +361,8 @@
       </w:r>
     </w:p>
     <w:sectPr>
-      <w:headerReference xmlns:r="http://schemas.openxmlformats.org/officeDocument/2006/relationships" w:type="default" r:id="R2e4a4660406849f4"/>
-      <w:footerReference xmlns:r="http://schemas.openxmlformats.org/officeDocument/2006/relationships" w:type="default" r:id="R7317ed04b9844e10"/>
+      <w:headerReference xmlns:r="http://schemas.openxmlformats.org/officeDocument/2006/relationships" w:type="default" r:id="R69729e99e165442f"/>
+      <w:footerReference xmlns:r="http://schemas.openxmlformats.org/officeDocument/2006/relationships" w:type="default" r:id="R9bbd3a1d015f4b4b"/>
       <w:pgSz w:w="11906" w:h="16838"/>
       <w:pgMar w:top="1440" w:right="1440" w:bottom="1440" w:left="1440" w:header="576" w:footer="576" w:gutter="0"/>
     </w:sectPr>

</xml_diff>

<commit_message>
refactor(looking-glass): relax backdrop blur to 1.5px, remove focus shapes, add square and logo cutout shapes
</commit_message>
<xml_diff>
--- a/marksmith-v2/test_outputs/challenger_scenario1.docx
+++ b/marksmith-v2/test_outputs/challenger_scenario1.docx
@@ -361,8 +361,8 @@
       </w:r>
     </w:p>
     <w:sectPr>
-      <w:headerReference xmlns:r="http://schemas.openxmlformats.org/officeDocument/2006/relationships" w:type="default" r:id="R69729e99e165442f"/>
-      <w:footerReference xmlns:r="http://schemas.openxmlformats.org/officeDocument/2006/relationships" w:type="default" r:id="R9bbd3a1d015f4b4b"/>
+      <w:headerReference xmlns:r="http://schemas.openxmlformats.org/officeDocument/2006/relationships" w:type="default" r:id="Rdafe07c01f214034"/>
+      <w:footerReference xmlns:r="http://schemas.openxmlformats.org/officeDocument/2006/relationships" w:type="default" r:id="Ra0405ea7a9804a25"/>
       <w:pgSz w:w="11906" w:h="16838"/>
       <w:pgMar w:top="1440" w:right="1440" w:bottom="1440" w:left="1440" w:header="576" w:footer="576" w:gutter="0"/>
     </w:sectPr>

</xml_diff>

<commit_message>
feat(recovery): add DocumentRecoveryVault for local storage snapshot auto-saving and crash recovery
</commit_message>
<xml_diff>
--- a/marksmith-v2/test_outputs/challenger_scenario1.docx
+++ b/marksmith-v2/test_outputs/challenger_scenario1.docx
@@ -361,8 +361,8 @@
       </w:r>
     </w:p>
     <w:sectPr>
-      <w:headerReference xmlns:r="http://schemas.openxmlformats.org/officeDocument/2006/relationships" w:type="default" r:id="Rdafe07c01f214034"/>
-      <w:footerReference xmlns:r="http://schemas.openxmlformats.org/officeDocument/2006/relationships" w:type="default" r:id="Ra0405ea7a9804a25"/>
+      <w:headerReference xmlns:r="http://schemas.openxmlformats.org/officeDocument/2006/relationships" w:type="default" r:id="Rfe4182b97f27400d"/>
+      <w:footerReference xmlns:r="http://schemas.openxmlformats.org/officeDocument/2006/relationships" w:type="default" r:id="Ra23c8bd526584d7d"/>
       <w:pgSz w:w="11906" w:h="16838"/>
       <w:pgMar w:top="1440" w:right="1440" w:bottom="1440" w:left="1440" w:header="576" w:footer="576" w:gutter="0"/>
     </w:sectPr>

</xml_diff>

<commit_message>
feat(footnotes): add FootnoteService for inline footnote parsing, sequential re-indexing, and section rendering
</commit_message>
<xml_diff>
--- a/marksmith-v2/test_outputs/challenger_scenario1.docx
+++ b/marksmith-v2/test_outputs/challenger_scenario1.docx
@@ -361,8 +361,8 @@
       </w:r>
     </w:p>
     <w:sectPr>
-      <w:headerReference xmlns:r="http://schemas.openxmlformats.org/officeDocument/2006/relationships" w:type="default" r:id="Rfe4182b97f27400d"/>
-      <w:footerReference xmlns:r="http://schemas.openxmlformats.org/officeDocument/2006/relationships" w:type="default" r:id="Ra23c8bd526584d7d"/>
+      <w:headerReference xmlns:r="http://schemas.openxmlformats.org/officeDocument/2006/relationships" w:type="default" r:id="Re1994c1684cf40e1"/>
+      <w:footerReference xmlns:r="http://schemas.openxmlformats.org/officeDocument/2006/relationships" w:type="default" r:id="Rcd85973b154c4e11"/>
       <w:pgSz w:w="11906" w:h="16838"/>
       <w:pgMar w:top="1440" w:right="1440" w:bottom="1440" w:left="1440" w:header="576" w:footer="576" w:gutter="0"/>
     </w:sectPr>

</xml_diff>

<commit_message>
feat(codeblock): add CodeBlockHighlighterService for code fence line numbering and line highlighting ranges
</commit_message>
<xml_diff>
--- a/marksmith-v2/test_outputs/challenger_scenario1.docx
+++ b/marksmith-v2/test_outputs/challenger_scenario1.docx
@@ -361,8 +361,8 @@
       </w:r>
     </w:p>
     <w:sectPr>
-      <w:headerReference xmlns:r="http://schemas.openxmlformats.org/officeDocument/2006/relationships" w:type="default" r:id="Re1994c1684cf40e1"/>
-      <w:footerReference xmlns:r="http://schemas.openxmlformats.org/officeDocument/2006/relationships" w:type="default" r:id="Rcd85973b154c4e11"/>
+      <w:headerReference xmlns:r="http://schemas.openxmlformats.org/officeDocument/2006/relationships" w:type="default" r:id="Rd8dbeba7ba1b4c22"/>
+      <w:footerReference xmlns:r="http://schemas.openxmlformats.org/officeDocument/2006/relationships" w:type="default" r:id="R546e1aa437a24197"/>
       <w:pgSz w:w="11906" w:h="16838"/>
       <w:pgMar w:top="1440" w:right="1440" w:bottom="1440" w:left="1440" w:header="576" w:footer="576" w:gutter="0"/>
     </w:sectPr>

</xml_diff>

<commit_message>
feat(spellcheck): add SpellCheckService for tokenized Markdown spell checking and Levenshtein suggestions
</commit_message>
<xml_diff>
--- a/marksmith-v2/test_outputs/challenger_scenario1.docx
+++ b/marksmith-v2/test_outputs/challenger_scenario1.docx
@@ -361,8 +361,8 @@
       </w:r>
     </w:p>
     <w:sectPr>
-      <w:headerReference xmlns:r="http://schemas.openxmlformats.org/officeDocument/2006/relationships" w:type="default" r:id="Rd8dbeba7ba1b4c22"/>
-      <w:footerReference xmlns:r="http://schemas.openxmlformats.org/officeDocument/2006/relationships" w:type="default" r:id="R546e1aa437a24197"/>
+      <w:headerReference xmlns:r="http://schemas.openxmlformats.org/officeDocument/2006/relationships" w:type="default" r:id="R3945f8218266458e"/>
+      <w:footerReference xmlns:r="http://schemas.openxmlformats.org/officeDocument/2006/relationships" w:type="default" r:id="R6a12b41b20d748b9"/>
       <w:pgSz w:w="11906" w:h="16838"/>
       <w:pgMar w:top="1440" w:right="1440" w:bottom="1440" w:left="1440" w:header="576" w:footer="576" w:gutter="0"/>
     </w:sectPr>

</xml_diff>

<commit_message>
feat(templates): add DocumentTemplateGalleryService for built-in Markdown presets and variable interpolation
</commit_message>
<xml_diff>
--- a/marksmith-v2/test_outputs/challenger_scenario1.docx
+++ b/marksmith-v2/test_outputs/challenger_scenario1.docx
@@ -361,8 +361,8 @@
       </w:r>
     </w:p>
     <w:sectPr>
-      <w:headerReference xmlns:r="http://schemas.openxmlformats.org/officeDocument/2006/relationships" w:type="default" r:id="R3945f8218266458e"/>
-      <w:footerReference xmlns:r="http://schemas.openxmlformats.org/officeDocument/2006/relationships" w:type="default" r:id="R6a12b41b20d748b9"/>
+      <w:headerReference xmlns:r="http://schemas.openxmlformats.org/officeDocument/2006/relationships" w:type="default" r:id="R90e543be2dd4462b"/>
+      <w:footerReference xmlns:r="http://schemas.openxmlformats.org/officeDocument/2006/relationships" w:type="default" r:id="R6245b8f09faf4cc1"/>
       <w:pgSz w:w="11906" w:h="16838"/>
       <w:pgMar w:top="1440" w:right="1440" w:bottom="1440" w:left="1440" w:header="576" w:footer="576" w:gutter="0"/>
     </w:sectPr>

</xml_diff>

<commit_message>
fix(tests): update TableFormatterServiceTests assertion to match padded column widths
</commit_message>
<xml_diff>
--- a/marksmith-v2/test_outputs/challenger_scenario1.docx
+++ b/marksmith-v2/test_outputs/challenger_scenario1.docx
@@ -361,8 +361,8 @@
       </w:r>
     </w:p>
     <w:sectPr>
-      <w:headerReference xmlns:r="http://schemas.openxmlformats.org/officeDocument/2006/relationships" w:type="default" r:id="R90e543be2dd4462b"/>
-      <w:footerReference xmlns:r="http://schemas.openxmlformats.org/officeDocument/2006/relationships" w:type="default" r:id="R6245b8f09faf4cc1"/>
+      <w:headerReference xmlns:r="http://schemas.openxmlformats.org/officeDocument/2006/relationships" w:type="default" r:id="R00e9ecad11a14779"/>
+      <w:footerReference xmlns:r="http://schemas.openxmlformats.org/officeDocument/2006/relationships" w:type="default" r:id="Ra49087dfbe974122"/>
       <w:pgSz w:w="11906" w:h="16838"/>
       <w:pgMar w:top="1440" w:right="1440" w:bottom="1440" w:left="1440" w:header="576" w:footer="576" w:gutter="0"/>
     </w:sectPr>

</xml_diff>

<commit_message>
feat(links): add LinkIntegrityAnalyzerService for Markdown link & anchor reference validation
</commit_message>
<xml_diff>
--- a/marksmith-v2/test_outputs/challenger_scenario1.docx
+++ b/marksmith-v2/test_outputs/challenger_scenario1.docx
@@ -361,8 +361,8 @@
       </w:r>
     </w:p>
     <w:sectPr>
-      <w:headerReference xmlns:r="http://schemas.openxmlformats.org/officeDocument/2006/relationships" w:type="default" r:id="R00e9ecad11a14779"/>
-      <w:footerReference xmlns:r="http://schemas.openxmlformats.org/officeDocument/2006/relationships" w:type="default" r:id="Ra49087dfbe974122"/>
+      <w:headerReference xmlns:r="http://schemas.openxmlformats.org/officeDocument/2006/relationships" w:type="default" r:id="R48ad62c8ea8f4fef"/>
+      <w:footerReference xmlns:r="http://schemas.openxmlformats.org/officeDocument/2006/relationships" w:type="default" r:id="R5ccb858053e84d73"/>
       <w:pgSz w:w="11906" w:h="16838"/>
       <w:pgMar w:top="1440" w:right="1440" w:bottom="1440" w:left="1440" w:header="576" w:footer="576" w:gutter="0"/>
     </w:sectPr>

</xml_diff>

<commit_message>
feat(readability): add ReadabilityAnalyzerService for Flesch Reading Ease & Grade Level complexity analysis
</commit_message>
<xml_diff>
--- a/marksmith-v2/test_outputs/challenger_scenario1.docx
+++ b/marksmith-v2/test_outputs/challenger_scenario1.docx
@@ -361,8 +361,8 @@
       </w:r>
     </w:p>
     <w:sectPr>
-      <w:headerReference xmlns:r="http://schemas.openxmlformats.org/officeDocument/2006/relationships" w:type="default" r:id="R48ad62c8ea8f4fef"/>
-      <w:footerReference xmlns:r="http://schemas.openxmlformats.org/officeDocument/2006/relationships" w:type="default" r:id="R5ccb858053e84d73"/>
+      <w:headerReference xmlns:r="http://schemas.openxmlformats.org/officeDocument/2006/relationships" w:type="default" r:id="Rd99d1d3b1a1d4bdc"/>
+      <w:footerReference xmlns:r="http://schemas.openxmlformats.org/officeDocument/2006/relationships" w:type="default" r:id="R1671b162ae0a4d0a"/>
       <w:pgSz w:w="11906" w:h="16838"/>
       <w:pgMar w:top="1440" w:right="1440" w:bottom="1440" w:left="1440" w:header="576" w:footer="576" w:gutter="0"/>
     </w:sectPr>

</xml_diff>

<commit_message>
feat(tags): add TagExtractorService for hashtag and key phrase extraction
</commit_message>
<xml_diff>
--- a/marksmith-v2/test_outputs/challenger_scenario1.docx
+++ b/marksmith-v2/test_outputs/challenger_scenario1.docx
@@ -361,8 +361,8 @@
       </w:r>
     </w:p>
     <w:sectPr>
-      <w:headerReference xmlns:r="http://schemas.openxmlformats.org/officeDocument/2006/relationships" w:type="default" r:id="Rd99d1d3b1a1d4bdc"/>
-      <w:footerReference xmlns:r="http://schemas.openxmlformats.org/officeDocument/2006/relationships" w:type="default" r:id="R1671b162ae0a4d0a"/>
+      <w:headerReference xmlns:r="http://schemas.openxmlformats.org/officeDocument/2006/relationships" w:type="default" r:id="Rdcfc17d6f32d4b2a"/>
+      <w:footerReference xmlns:r="http://schemas.openxmlformats.org/officeDocument/2006/relationships" w:type="default" r:id="Raa183ef96368444b"/>
       <w:pgSz w:w="11906" w:h="16838"/>
       <w:pgMar w:top="1440" w:right="1440" w:bottom="1440" w:left="1440" w:header="576" w:footer="576" w:gutter="0"/>
     </w:sectPr>

</xml_diff>

<commit_message>
feat: complete Tasks 20-30 and 10 polish items across Marksmith v2 suite (985 passed / 0 failed / 21 skipped / 1006 total)
</commit_message>
<xml_diff>
--- a/marksmith-v2/test_outputs/challenger_scenario1.docx
+++ b/marksmith-v2/test_outputs/challenger_scenario1.docx
@@ -361,8 +361,8 @@
       </w:r>
     </w:p>
     <w:sectPr>
-      <w:headerReference xmlns:r="http://schemas.openxmlformats.org/officeDocument/2006/relationships" w:type="default" r:id="Rdcfc17d6f32d4b2a"/>
-      <w:footerReference xmlns:r="http://schemas.openxmlformats.org/officeDocument/2006/relationships" w:type="default" r:id="Raa183ef96368444b"/>
+      <w:headerReference xmlns:r="http://schemas.openxmlformats.org/officeDocument/2006/relationships" w:type="default" r:id="Ra252ea2338fa45f4"/>
+      <w:footerReference xmlns:r="http://schemas.openxmlformats.org/officeDocument/2006/relationships" w:type="default" r:id="R5b32166150824525"/>
       <w:pgSz w:w="11906" w:h="16838"/>
       <w:pgMar w:top="1440" w:right="1440" w:bottom="1440" w:left="1440" w:header="576" w:footer="576" w:gutter="0"/>
     </w:sectPr>

</xml_diff>

<commit_message>
release: v2.9.0 — New transparent app icon, updated README hero media, core performance optimizations, and browser extension sparse override model
</commit_message>
<xml_diff>
--- a/marksmith-v2/test_outputs/challenger_scenario1.docx
+++ b/marksmith-v2/test_outputs/challenger_scenario1.docx
@@ -361,8 +361,8 @@
       </w:r>
     </w:p>
     <w:sectPr>
-      <w:headerReference xmlns:r="http://schemas.openxmlformats.org/officeDocument/2006/relationships" w:type="default" r:id="Ra252ea2338fa45f4"/>
-      <w:footerReference xmlns:r="http://schemas.openxmlformats.org/officeDocument/2006/relationships" w:type="default" r:id="R5b32166150824525"/>
+      <w:headerReference xmlns:r="http://schemas.openxmlformats.org/officeDocument/2006/relationships" w:type="default" r:id="R0a6eaf2212854233"/>
+      <w:footerReference xmlns:r="http://schemas.openxmlformats.org/officeDocument/2006/relationships" w:type="default" r:id="R31c089697e854d6b"/>
       <w:pgSz w:w="11906" w:h="16838"/>
       <w:pgMar w:top="1440" w:right="1440" w:bottom="1440" w:left="1440" w:header="576" w:footer="576" w:gutter="0"/>
     </w:sectPr>
@@ -779,4 +779,22 @@
     </w:rPr>
   </w:style>
 </w:styles>
+</file>
+
+<file path=customXml/item.xml><?xml version="1.0" encoding="utf-8"?>
+<marksmithSource schema="marksmith-source-v1" version="2.0.0.0" exportedUtc="2026-07-31T16:52:29.7663561Z" theme="GitHub Light" mermaidMode="1">
+  <markdown><![CDATA[# Interactive Tabbed Content
+:::tabs
+:::tab title="Overview"
+This is the **Overview** section content.
+:::
+:::tab title="Specifications"
+These are the **Specifications** details.
+:::
+:::tab title="Architecture"
+This is the **Architecture** system design.
+:::
+:::
+]]></markdown>
+</marksmithSource>
 </file>
</xml_diff>